<commit_message>
Reject nonfinite future native publications and persist confirmed failure status
Instrument the existing standard optimizer loss/step and native save/load boundaries through the current wrapper without changing frozen snapshots or finite-run arithmetic/configs. Preserve all original zero scores and aggregates while recording five confirmed nonfinite Student/EMA/optimizer failures, one finite control and an unknown first operator. Current221 DIOR smoke/fit state supersedes old path-failure notices; no active LoRA code change, GPU action, replay, tuning or batch reduction.

Co-authored-by: Copilot <223556219+Copilot@users.noreply.github.com>
</commit_message>
<xml_diff>
--- a/results/extensions/ports108_ema/comparison_report_cn.docx
+++ b/results/extensions/ports108_ema/comparison_report_cn.docx
@@ -35,37 +35,32 @@
     </w:p>
     <w:p>
       <w:r>
-        <w:t>本次只收集已完成的 IRG/LPLD/SFUT 各36个最终 EMA 全 TEST 单元，并复用12个固定 source 单元：量化证据120/120完整。AASFOD、SFYOLO、消融、Student及RoI结果不在本次量化范围；整体扩展交付仍未完成。</w:t>
+        <w:t>诊断更新：限定的只读检查已确认五个RSAR种子44零检测单元是数值失败，最终Student、EMA和优化器状态均含NaN，不是单纯的有限模型差表现。所有原始零分、原生输出及既有均值/统计保持不变。</w:t>
       </w:r>
     </w:p>
     <w:p>
       <w:r>
-        <w:t>RSAR 的固定 A mPC 为31.7142%。IRG/LPLD/SFUT 的三种子 mPC 均值分别为30.6249%、28.8620%、32.2515%，相对 A 为-1.0893、-2.8521、+0.5373个百分点；相对 mPC 变化为-3.4347%、-8.9933%、+1.6943%。</w:t>
+        <w:t>五个受影响EMA各有195/343个浮点张量含NaN；IRG Student为213/361，LPLD/SFUT Student为195/343。日志在截至240的块仍有限，截至250和260的块为NaN；没有健康的中间检查点，首个算术算子尚未确定。</w:t>
       </w:r>
     </w:p>
     <w:p>
       <w:r>
-        <w:t>RSAR种子44出现五个零检测单元：point_target上的IRG/LPLD，以及noise_suppression上的IRG/LPLD/SFUT，均为8538张TEST图像、0个post-NMS检测、mAP=0。这些实际零结果保留在均值与统计中；原生输出完整不等于已确认训练数值健康，零检测原因尚未在本次收集中诊断。</w:t>
+        <w:t>唯一对照为IRG/point_target/seed43：Student、EMA和优化器均有限，原生检测103767个、mAP50=52.6134%。不能据此宣称其余103个运行全部健康；其中只检查了这个对照。</w:t>
       </w:r>
     </w:p>
     <w:p>
       <w:r>
-        <w:t>RSAR的IRG种子42/43/44 mPC为34.0998%、34.0452%、23.7296%；LPLD为32.6856%、32.2499%、21.6506%。第三个种子的零检测单元造成明显波动，不得删除、择优替换或据此自动重跑。</w:t>
+        <w:t>六个检查对象的原生检查点路径、配置、代码版本、类别和8538个图像记录一致，EMA键/形状与对照一致，没有原生评估加载不匹配。IRG缺少18个新辅助参数的source初始化警告也出现在健康对照中，不是缺失检测器权重的证据。</w:t>
       </w:r>
     </w:p>
     <w:p>
       <w:r>
-        <w:t>DIOR 的固定 A mPC 为27.1185%。IRG/LPLD/SFUT 均值分别为27.3923%、27.5468%、27.2890%，相对 A 为+0.2738、+0.4283、+0.1705个百分点；相对 mPC 变化为+1.0095%、+1.5793%、+0.6288%。</w:t>
+        <w:t>本报告仍记录108个EMA加12个固定source的120/120原生量化产物完整性；这不等于数值健康。RSAR mPC仍为A31.7142%、IRG30.6249%、LPLD28.8620%、SFUT32.2515%；DIOR仍为A27.1185%、IRG27.3923%、LPLD27.5468%、SFUT27.2890%。统计不删除失败种子，也不应解释成三次均成功的有限训练重复。</w:t>
       </w:r>
     </w:p>
     <w:p>
       <w:r>
-        <w:t>统计单位是三个适配种子，条件于同一固定 source。当前三方法阶段的mPC配对差值精确双侧sign-flip Holm p：RSAR均为1，DIOR均为0.75。DIOR SFUT的t检验Holm p约0.001188依赖差值正态假设及很小的种子方差，不能替代分布无关证据；本阶段校正不是未来全部方法的最终比较家族。</w:t>
-      </w:r>
-    </w:p>
-    <w:p>
-      <w:r>
-        <w:t>五个零检测单元没有可用于当前均衡采样t-SNE的检测实例，影响种子44的RSAR point_target/EMA及noise_suppression/EMA联合组。不得伪造点、换种子或调整展示阈值来隐藏问题；完整RoI/可视化/嵌入交付仍等待实际GPU输出及对此现象的解释。</w:t>
+        <w:t>种子44的RSAR point_target/EMA与noise_suppression/EMA联合组须明确显示数值失败导致的缺失可用点，不能伪造点、静默去掉方法、换种子或调整阈值。后续仅增加非有限值失败检测；本诊断没有执行重放、重训或调参。</w:t>
       </w:r>
     </w:p>
     <w:p>

</xml_diff>